<commit_message>
Changed architecture, skip/transfer training feature
</commit_message>
<xml_diff>
--- a/Документация/ТЗ FitMaster.docx
+++ b/Документация/ТЗ FitMaster.docx
@@ -849,25 +849,13 @@
         <w:rPr>
           <w:lang w:val="en-US"/>
         </w:rPr>
-        <w:t>: SQL</w:t>
+        <w:t xml:space="preserve">: </w:t>
       </w:r>
       <w:r>
         <w:rPr>
           <w:lang w:val="en-US"/>
         </w:rPr>
-        <w:t xml:space="preserve"> </w:t>
-      </w:r>
-      <w:r>
-        <w:rPr>
-          <w:lang w:val="en-US"/>
-        </w:rPr>
-        <w:t>Server Express</w:t>
-      </w:r>
-      <w:r>
-        <w:rPr>
-          <w:lang w:val="en-US"/>
-        </w:rPr>
-        <w:t xml:space="preserve"> (SSMS 19)</w:t>
+        <w:t>PostGre</w:t>
       </w:r>
     </w:p>
     <w:p>

</xml_diff>